<commit_message>
docs(Suplementary Specification): updated Suplementary Specification document
</commit_message>
<xml_diff>
--- a/docs/04 Supplementary Specification.docx
+++ b/docs/04 Supplementary Specification.docx
@@ -139,7 +139,25 @@
           <w:sz w:val="28"/>
           <w:szCs w:val="28"/>
         </w:rPr>
-        <w:t>Version 1.0</w:t>
+        <w:t xml:space="preserve">Version </w:t>
+      </w:r>
+      <w:r>
+        <w:rPr>
+          <w:b/>
+          <w:bCs/>
+          <w:sz w:val="28"/>
+          <w:szCs w:val="28"/>
+        </w:rPr>
+        <w:t>2</w:t>
+      </w:r>
+      <w:r>
+        <w:rPr>
+          <w:b/>
+          <w:bCs/>
+          <w:sz w:val="28"/>
+          <w:szCs w:val="28"/>
+        </w:rPr>
+        <w:t>.0</w:t>
       </w:r>
     </w:p>
     <w:p>
@@ -362,7 +380,19 @@
               <w:spacing w:before="240" w:after="240"/>
             </w:pPr>
             <w:r>
-              <w:t>28.03.2026</w:t>
+              <w:t>28</w:t>
+            </w:r>
+            <w:r>
+              <w:t>/</w:t>
+            </w:r>
+            <w:r>
+              <w:t>03</w:t>
+            </w:r>
+            <w:r>
+              <w:t>/</w:t>
+            </w:r>
+            <w:r>
+              <w:t>2026</w:t>
             </w:r>
           </w:p>
         </w:tc>
@@ -476,7 +506,7 @@
               <w:spacing w:before="240" w:after="240"/>
             </w:pPr>
             <w:r>
-              <w:t xml:space="preserve"> </w:t>
+              <w:t>16/05/2026</w:t>
             </w:r>
           </w:p>
         </w:tc>
@@ -501,6 +531,9 @@
               <w:spacing w:before="240" w:after="240"/>
             </w:pPr>
             <w:r>
+              <w:t>2.0</w:t>
+            </w:r>
+            <w:r>
               <w:t xml:space="preserve"> </w:t>
             </w:r>
           </w:p>
@@ -526,6 +559,9 @@
               <w:spacing w:before="240" w:after="240"/>
             </w:pPr>
             <w:r>
+              <w:t>Final version</w:t>
+            </w:r>
+            <w:r>
               <w:t xml:space="preserve"> </w:t>
             </w:r>
           </w:p>
@@ -550,6 +586,15 @@
             <w:pPr>
               <w:spacing w:before="240" w:after="240"/>
             </w:pPr>
+            <w:r>
+              <w:t>Mule</w:t>
+            </w:r>
+            <w:r>
+              <w:rPr>
+                <w:lang w:val="en-US"/>
+              </w:rPr>
+              <w:t>ș Alexandru</w:t>
+            </w:r>
             <w:r>
               <w:t xml:space="preserve"> </w:t>
             </w:r>

</xml_diff>